<commit_message>
docs(jira): add JIRA agile project management documentation, sprint 5 backlog, importable CSV, and updated group summaries
</commit_message>
<xml_diff>
--- a/GroupNumber_Summary.docx
+++ b/GroupNumber_Summary.docx
@@ -586,6 +586,134 @@
           <w:szCs w:val="15"/>
         </w:rPr>
         <w:t xml:space="preserve">Delivered natural language inventory assistant with dynamic student context injection (active borrows, due dates, course practicals); built hybrid RAG engine retrieving equipment operating specs and calibration procedures from manuals with SSE token streaming.</w:t>
+      </w:r>
+    </w:p>
+    <w:p>
+      <w:pPr>
+        <w:shd w:fill="F1F5F9" w:val="clear"/>
+        <w:spacing w:after="20" w:before="65"/>
+      </w:pPr>
+      <w:r>
+        <w:rPr>
+          <w:b/>
+          <w:bCs/>
+          <w:color w:val="1E40AF"/>
+          <w:sz w:val="17"/>
+          <w:szCs w:val="17"/>
+        </w:rPr>
+        <w:t xml:space="preserve">  Sprint 5: Technician-Supervised Workflows, Group Scheduling, Master Timetable &amp; Safety Hub</w:t>
+      </w:r>
+    </w:p>
+    <w:p>
+      <w:pPr>
+        <w:pStyle w:val="ListParagraph"/>
+        <w:numPr>
+          <w:ilvl w:val="0"/>
+          <w:numId w:val="1"/>
+        </w:numPr>
+        <w:spacing w:after="14"/>
+      </w:pPr>
+      <w:r>
+        <w:rPr>
+          <w:b/>
+          <w:bCs/>
+          <w:color w:val="111827"/>
+          <w:sz w:val="15"/>
+          <w:szCs w:val="15"/>
+        </w:rPr>
+        <w:t xml:space="preserve">Frontend (Harsha): </w:t>
+      </w:r>
+      <w:r>
+        <w:rPr>
+          <w:color w:val="374151"/>
+          <w:sz w:val="15"/>
+          <w:szCs w:val="15"/>
+        </w:rPr>
+        <w:t xml:space="preserve">Delivered interactive Excel-style Master Timetable workbook (formula bar, cell coordinates, CSV export); built 6th-semester EE student group manager (EE1-EE11); implemented group-isolated timetable and notifications; engineered practicals catalog with prerequisite checklists, PDF lab manual viewer, and staff document upload modal; redesigned barcode camera scanner with high-precision reticle viewfinder; integrated authentic department laboratory photography.</w:t>
+      </w:r>
+    </w:p>
+    <w:p>
+      <w:pPr>
+        <w:pStyle w:val="ListParagraph"/>
+        <w:numPr>
+          <w:ilvl w:val="0"/>
+          <w:numId w:val="1"/>
+        </w:numPr>
+        <w:spacing w:after="14"/>
+      </w:pPr>
+      <w:r>
+        <w:rPr>
+          <w:b/>
+          <w:bCs/>
+          <w:color w:val="111827"/>
+          <w:sz w:val="15"/>
+          <w:szCs w:val="15"/>
+        </w:rPr>
+        <w:t xml:space="preserve">Backend (Priyan): </w:t>
+      </w:r>
+      <w:r>
+        <w:rPr>
+          <w:color w:val="374151"/>
+          <w:sz w:val="15"/>
+          <w:szCs w:val="15"/>
+        </w:rPr>
+        <w:t xml:space="preserve">Engineered strict 2-step equipment borrowing pipeline (student borrow request -&gt; technician verification &amp; approval) with outside-lab loan authorization; developed 6th-semester student auto-partitioning engine (75 students into 11 balanced groups); implemented multi-party real-time notification engine with automated due-date reminders; created multi-semester schedule matrix (/academic/semesters/all/timetable) for administrators.</w:t>
+      </w:r>
+    </w:p>
+    <w:p>
+      <w:pPr>
+        <w:pStyle w:val="ListParagraph"/>
+        <w:numPr>
+          <w:ilvl w:val="0"/>
+          <w:numId w:val="1"/>
+        </w:numPr>
+        <w:spacing w:after="14"/>
+      </w:pPr>
+      <w:r>
+        <w:rPr>
+          <w:b/>
+          <w:bCs/>
+          <w:color w:val="111827"/>
+          <w:sz w:val="15"/>
+          <w:szCs w:val="15"/>
+        </w:rPr>
+        <w:t xml:space="preserve">Vision &amp; Hardware (Pamudu): </w:t>
+      </w:r>
+      <w:r>
+        <w:rPr>
+          <w:color w:val="374151"/>
+          <w:sz w:val="15"/>
+          <w:szCs w:val="15"/>
+        </w:rPr>
+        <w:t xml:space="preserve">Enhanced optical tag acquisition algorithms with adaptive lighting contrast filtering; tested high-speed camera scanning accuracy across diverse equipment surfaces and curved cables; calibrated barcode viewfinder alignment for mobile and webcam sensors.</w:t>
+      </w:r>
+    </w:p>
+    <w:p>
+      <w:pPr>
+        <w:pStyle w:val="ListParagraph"/>
+        <w:numPr>
+          <w:ilvl w:val="0"/>
+          <w:numId w:val="1"/>
+        </w:numPr>
+        <w:spacing w:after="14"/>
+      </w:pPr>
+      <w:r>
+        <w:rPr>
+          <w:b/>
+          <w:bCs/>
+          <w:color w:val="111827"/>
+          <w:sz w:val="15"/>
+          <w:szCs w:val="15"/>
+        </w:rPr>
+        <w:t xml:space="preserve">AI Engine (Imal): </w:t>
+      </w:r>
+      <w:r>
+        <w:rPr>
+          <w:color w:val="374151"/>
+          <w:sz w:val="15"/>
+          <w:szCs w:val="15"/>
+        </w:rPr>
+        <w:t xml:space="preserve">Updated deterministic inventory SQL generator to support request states (PENDING_APPROVAL, APPROVED, REJECTED) and outside-lab loan queries; indexed 6th-semester lab manual safety procedures and prerequisite requirements into ChromaDB RAG vector store for instant student safety queries.</w:t>
       </w:r>
     </w:p>
     <w:p>
@@ -604,7 +732,7 @@
           <w:sz w:val="14"/>
           <w:szCs w:val="14"/>
         </w:rPr>
-        <w:t xml:space="preserve">ELABS Monorepo Project  •  Department of Electrical &amp; Information Engineering  •  Single-Page Summary Document</w:t>
+        <w:t xml:space="preserve">ELABS Monorepo Project  •  Department of Electrical &amp; Information Engineering  •  Project Summary Document</w:t>
       </w:r>
     </w:p>
     <w:sectPr>

</xml_diff>